<commit_message>
feat(contracts): implement advanced filters, classification checks, and export options
</commit_message>
<xml_diff>
--- a/tvt3_v2/public/templates/THANH_LY_KY_LAI_CSHT.docx
+++ b/tvt3_v2/public/templates/THANH_LY_KY_LAI_CSHT.docx
@@ -3348,7 +3348,7 @@
           <w:szCs w:val="26"/>
           <w:lang w:val="fr-FR"/>
         </w:rPr>
-        <w:t>(Giấy UQ số 08/UQ-MBF.ĐNa ngày 22/01/2026 do Giám đốc MobiFone Đồng Nai – Chi nhánh Tổng Công ty Viễn Thông MobiFone, Ông Bùi Chí Tuệ ký)</w:t>
+        <w:t>(Giấy UQ số 21/UQ-MBF.ĐNa ngày 19/06/2026 do Giám đốc MobiFone Đồng Nai – Chi nhánh Tổng Công ty Viễn Thông MobiFone, Ông Bùi Chí Tuệ ký)</w:t>
       </w:r>
     </w:p>
     <w:p>
@@ -5072,7 +5072,7 @@
           <w:szCs w:val="26"/>
           <w:lang w:val="fr-FR"/>
         </w:rPr>
-        <w:t>(Giấy UQ số 08/UQ-MBF.ĐNa ngày 22/01/2026 do Giám đốc MobiFone Đồng Nai – Chi nhánh Tổng Công ty Viễn Thông MobiFone, Ông Bùi Chí Tuệ ký)</w:t>
+        <w:t>(Giấy UQ số 21/UQ-MBF.ĐNa ngày 19/06/2026 do Giám đốc MobiFone Đồng Nai – Chi nhánh Tổng Công ty Viễn Thông MobiFone, Ông Bùi Chí Tuệ ký)</w:t>
       </w:r>
     </w:p>
     <w:p>

</xml_diff>